<commit_message>
docs: standardize TraceId and SpanId to snake_case trace_id and span_id across regulation docx and guide
</commit_message>
<xml_diff>
--- a/docs/ISC_QuyDinh_Observability_v1_0.docx
+++ b/docs/ISC_QuyDinh_Observability_v1_0.docx
@@ -1848,7 +1848,7 @@
               <w:rPr>
                 <w:lang w:val="en-US"/>
               </w:rPr>
-              <w:t>TraceId</w:t>
+              <w:t>trace_id</w:t>
             </w:r>
             <w:r>
               <w:rPr>
@@ -1860,7 +1860,7 @@
               <w:rPr>
                 <w:lang w:val="en-US"/>
               </w:rPr>
-              <w:t>SpanId</w:t>
+              <w:t>span_id</w:t>
             </w:r>
           </w:p>
         </w:tc>
@@ -2101,7 +2101,7 @@
               <w:rPr>
                 <w:lang w:val="en-US"/>
               </w:rPr>
-              <w:t>TraceId</w:t>
+              <w:t>trace_id</w:t>
             </w:r>
             <w:r>
               <w:rPr>
@@ -2113,7 +2113,7 @@
               <w:rPr>
                 <w:lang w:val="en-US"/>
               </w:rPr>
-              <w:t>SpanId</w:t>
+              <w:t>span_id</w:t>
             </w:r>
             <w:r>
               <w:rPr>
@@ -17146,7 +17146,7 @@
               <w:rPr>
                 <w:lang w:val="en-US"/>
               </w:rPr>
-              <w:t>TraceId</w:t>
+              <w:t>trace_id</w:t>
             </w:r>
           </w:p>
         </w:tc>
@@ -17290,7 +17290,7 @@
               <w:rPr>
                 <w:lang w:val="en-US"/>
               </w:rPr>
-              <w:t>Giám sát metric observability.sdk.active = 1, tỷ lệ truyền TraceId và đối chiếu đủ 3 trụ cột (Logs, Traces, Metrics) tại Quality Gate 2 (Mức độ: BLOCKER).</w:t>
+              <w:t>Giám sát metric observability.sdk.active = 1, tỷ lệ truyền trace_id và đối chiếu đủ 3 trụ cột (Logs, Traces, Metrics) tại Quality Gate 2 (Mức độ: BLOCKER).</w:t>
             </w:r>
           </w:p>
         </w:tc>
@@ -17936,7 +17936,7 @@
         <w:rPr>
           <w:lang w:val="en-US"/>
         </w:rPr>
-        <w:t>TraceId</w:t>
+        <w:t>trace_id</w:t>
       </w:r>
       <w:r>
         <w:rPr>
@@ -17960,7 +17960,7 @@
         <w:rPr>
           <w:lang w:val="en-US"/>
         </w:rPr>
-        <w:t>SpanId</w:t>
+        <w:t>span_id</w:t>
       </w:r>
     </w:p>
     <w:p>
@@ -17982,7 +17982,7 @@
         <w:rPr>
           <w:lang w:val="en-US"/>
         </w:rPr>
-        <w:t>TraceId</w:t>
+        <w:t>trace_id</w:t>
       </w:r>
       <w:r>
         <w:rPr>
@@ -18154,7 +18154,7 @@
         <w:rPr>
           <w:lang w:val="en-US"/>
         </w:rPr>
-        <w:t>TraceId</w:t>
+        <w:t>trace_id</w:t>
       </w:r>
       <w:r>
         <w:rPr>

</xml_diff>

<commit_message>
docs: clearly delineate automatic OTel/SDK fields vs developer custom fields
</commit_message>
<xml_diff>
--- a/docs/ISC_QuyDinh_Observability_v1_0.docx
+++ b/docs/ISC_QuyDinh_Observability_v1_0.docx
@@ -1876,178 +1876,8 @@
             <w:tcMar/>
           </w:tcPr>
           <w:p>
-            <w:pPr>
-              <w:spacing w:after="120"/>
-              <w:ind w:left="0" w:firstLine="0"/>
-              <w:jc w:val="left"/>
-            </w:pPr>
-            <w:r>
-              <w:rPr>
-                <w:lang w:val="en-US"/>
-              </w:rPr>
-              <w:t>Mã</w:t>
-            </w:r>
-            <w:r>
-              <w:rPr>
-                <w:lang w:val="en-US"/>
-              </w:rPr>
-              <w:t xml:space="preserve"> </w:t>
-            </w:r>
-            <w:r>
-              <w:rPr>
-                <w:lang w:val="en-US"/>
-              </w:rPr>
-              <w:t>định</w:t>
-            </w:r>
-            <w:r>
-              <w:rPr>
-                <w:lang w:val="en-US"/>
-              </w:rPr>
-              <w:t xml:space="preserve"> </w:t>
-            </w:r>
-            <w:r>
-              <w:rPr>
-                <w:lang w:val="en-US"/>
-              </w:rPr>
-              <w:t>danh</w:t>
-            </w:r>
-            <w:r>
-              <w:rPr>
-                <w:lang w:val="en-US"/>
-              </w:rPr>
-              <w:t xml:space="preserve"> </w:t>
-            </w:r>
-            <w:r>
-              <w:rPr>
-                <w:lang w:val="en-US"/>
-              </w:rPr>
-              <w:t>của</w:t>
-            </w:r>
-            <w:r>
-              <w:rPr>
-                <w:lang w:val="en-US"/>
-              </w:rPr>
-              <w:t xml:space="preserve"> trace </w:t>
-            </w:r>
-            <w:r>
-              <w:rPr>
-                <w:lang w:val="en-US"/>
-              </w:rPr>
-              <w:t>và</w:t>
-            </w:r>
-            <w:r>
-              <w:rPr>
-                <w:lang w:val="en-US"/>
-              </w:rPr>
-              <w:t xml:space="preserve"> </w:t>
-            </w:r>
-            <w:r>
-              <w:rPr>
-                <w:lang w:val="en-US"/>
-              </w:rPr>
-              <w:t>của</w:t>
-            </w:r>
-            <w:r>
-              <w:rPr>
-                <w:lang w:val="en-US"/>
-              </w:rPr>
-              <w:t xml:space="preserve"> </w:t>
-            </w:r>
-            <w:r>
-              <w:rPr>
-                <w:lang w:val="en-US"/>
-              </w:rPr>
-              <w:t>từng</w:t>
-            </w:r>
-            <w:r>
-              <w:rPr>
-                <w:lang w:val="en-US"/>
-              </w:rPr>
-              <w:t xml:space="preserve"> span, </w:t>
-            </w:r>
-            <w:r>
-              <w:rPr>
-                <w:lang w:val="en-US"/>
-              </w:rPr>
-              <w:t>dùng</w:t>
-            </w:r>
-            <w:r>
-              <w:rPr>
-                <w:lang w:val="en-US"/>
-              </w:rPr>
-              <w:t xml:space="preserve"> </w:t>
-            </w:r>
-            <w:r>
-              <w:rPr>
-                <w:lang w:val="en-US"/>
-              </w:rPr>
-              <w:t>để</w:t>
-            </w:r>
-            <w:r>
-              <w:rPr>
-                <w:lang w:val="en-US"/>
-              </w:rPr>
-              <w:t xml:space="preserve"> </w:t>
-            </w:r>
-            <w:r>
-              <w:rPr>
-                <w:lang w:val="en-US"/>
-              </w:rPr>
-              <w:t>ghép</w:t>
-            </w:r>
-            <w:r>
-              <w:rPr>
-                <w:lang w:val="en-US"/>
-              </w:rPr>
-              <w:t xml:space="preserve"> log </w:t>
-            </w:r>
-            <w:r>
-              <w:rPr>
-                <w:lang w:val="en-US"/>
-              </w:rPr>
-              <w:t>và</w:t>
-            </w:r>
-            <w:r>
-              <w:rPr>
-                <w:lang w:val="en-US"/>
-              </w:rPr>
-              <w:t xml:space="preserve"> span </w:t>
-            </w:r>
-            <w:r>
-              <w:rPr>
-                <w:lang w:val="en-US"/>
-              </w:rPr>
-              <w:t>về</w:t>
-            </w:r>
-            <w:r>
-              <w:rPr>
-                <w:lang w:val="en-US"/>
-              </w:rPr>
-              <w:t xml:space="preserve"> </w:t>
-            </w:r>
-            <w:r>
-              <w:rPr>
-                <w:lang w:val="en-US"/>
-              </w:rPr>
-              <w:t>đúng</w:t>
-            </w:r>
-            <w:r>
-              <w:rPr>
-                <w:lang w:val="en-US"/>
-              </w:rPr>
-              <w:t xml:space="preserve"> </w:t>
-            </w:r>
-            <w:r>
-              <w:rPr>
-                <w:lang w:val="en-US"/>
-              </w:rPr>
-              <w:t>một</w:t>
-            </w:r>
-            <w:r>
-              <w:rPr>
-                <w:lang w:val="en-US"/>
-              </w:rPr>
-              <w:t xml:space="preserve"> request.</w:t>
+            <w:r>
+              <w:t>Mã định danh của trace và từng span do OpenTelemetry &amp; SDK tự động sinh/truyền dẫn (W3C traceparent). Developer không cần tự sinh hay truyền thủ công.</w:t>
             </w:r>
           </w:p>
         </w:tc>
@@ -2086,184 +1916,8 @@
             <w:tcMar/>
           </w:tcPr>
           <w:p>
-            <w:pPr>
-              <w:spacing w:after="120"/>
-              <w:ind w:left="0" w:firstLine="0"/>
-              <w:jc w:val="left"/>
-            </w:pPr>
-            <w:r>
-              <w:rPr>
-                <w:lang w:val="en-US"/>
-              </w:rPr>
-              <w:t xml:space="preserve">Thông tin </w:t>
-            </w:r>
-            <w:r>
-              <w:rPr>
-                <w:lang w:val="en-US"/>
-              </w:rPr>
-              <w:t>trace_id</w:t>
-            </w:r>
-            <w:r>
-              <w:rPr>
-                <w:lang w:val="en-US"/>
-              </w:rPr>
-              <w:t>/</w:t>
-            </w:r>
-            <w:r>
-              <w:rPr>
-                <w:lang w:val="en-US"/>
-              </w:rPr>
-              <w:t>span_id</w:t>
-            </w:r>
-            <w:r>
-              <w:rPr>
-                <w:lang w:val="en-US"/>
-              </w:rPr>
-              <w:t xml:space="preserve"> </w:t>
-            </w:r>
-            <w:r>
-              <w:rPr>
-                <w:lang w:val="en-US"/>
-              </w:rPr>
-              <w:t>được</w:t>
-            </w:r>
-            <w:r>
-              <w:rPr>
-                <w:lang w:val="en-US"/>
-              </w:rPr>
-              <w:t xml:space="preserve"> </w:t>
-            </w:r>
-            <w:r>
-              <w:rPr>
-                <w:lang w:val="en-US"/>
-              </w:rPr>
-              <w:t>truyền</w:t>
-            </w:r>
-            <w:r>
-              <w:rPr>
-                <w:lang w:val="en-US"/>
-              </w:rPr>
-              <w:t xml:space="preserve"> </w:t>
-            </w:r>
-            <w:r>
-              <w:rPr>
-                <w:lang w:val="en-US"/>
-              </w:rPr>
-              <w:t>kèm</w:t>
-            </w:r>
-            <w:r>
-              <w:rPr>
-                <w:lang w:val="en-US"/>
-              </w:rPr>
-              <w:t xml:space="preserve"> </w:t>
-            </w:r>
-            <w:r>
-              <w:rPr>
-                <w:lang w:val="en-US"/>
-              </w:rPr>
-              <w:t>lời</w:t>
-            </w:r>
-            <w:r>
-              <w:rPr>
-                <w:lang w:val="en-US"/>
-              </w:rPr>
-              <w:t xml:space="preserve"> </w:t>
-            </w:r>
-            <w:r>
-              <w:rPr>
-                <w:lang w:val="en-US"/>
-              </w:rPr>
-              <w:t>gọi</w:t>
-            </w:r>
-            <w:r>
-              <w:rPr>
-                <w:lang w:val="en-US"/>
-              </w:rPr>
-              <w:t xml:space="preserve"> </w:t>
-            </w:r>
-            <w:r>
-              <w:rPr>
-                <w:lang w:val="en-US"/>
-              </w:rPr>
-              <w:t>giữa</w:t>
-            </w:r>
-            <w:r>
-              <w:rPr>
-                <w:lang w:val="en-US"/>
-              </w:rPr>
-              <w:t xml:space="preserve"> </w:t>
-            </w:r>
-            <w:r>
-              <w:rPr>
-                <w:lang w:val="en-US"/>
-              </w:rPr>
-              <w:t>các</w:t>
-            </w:r>
-            <w:r>
-              <w:rPr>
-                <w:lang w:val="en-US"/>
-              </w:rPr>
-              <w:t xml:space="preserve"> service </w:t>
-            </w:r>
-            <w:r>
-              <w:rPr>
-                <w:lang w:val="en-US"/>
-              </w:rPr>
-              <w:t>để</w:t>
-            </w:r>
-            <w:r>
-              <w:rPr>
-                <w:lang w:val="en-US"/>
-              </w:rPr>
-              <w:t xml:space="preserve"> trace </w:t>
-            </w:r>
-            <w:r>
-              <w:rPr>
-                <w:lang w:val="en-US"/>
-              </w:rPr>
-              <w:t>không</w:t>
-            </w:r>
-            <w:r>
-              <w:rPr>
-                <w:lang w:val="en-US"/>
-              </w:rPr>
-              <w:t xml:space="preserve"> </w:t>
-            </w:r>
-            <w:r>
-              <w:rPr>
-                <w:lang w:val="en-US"/>
-              </w:rPr>
-              <w:t>bị</w:t>
-            </w:r>
-            <w:r>
-              <w:rPr>
-                <w:lang w:val="en-US"/>
-              </w:rPr>
-              <w:t xml:space="preserve"> </w:t>
-            </w:r>
-            <w:r>
-              <w:rPr>
-                <w:lang w:val="en-US"/>
-              </w:rPr>
-              <w:t>đứt</w:t>
-            </w:r>
-            <w:r>
-              <w:rPr>
-                <w:lang w:val="en-US"/>
-              </w:rPr>
-              <w:t xml:space="preserve"> </w:t>
-            </w:r>
-            <w:r>
-              <w:rPr>
-                <w:lang w:val="en-US"/>
-              </w:rPr>
-              <w:t>đoạn</w:t>
-            </w:r>
-            <w:r>
-              <w:rPr>
-                <w:lang w:val="en-US"/>
-              </w:rPr>
-              <w:t>.</w:t>
+            <w:r>
+              <w:t>Thông tin trace_id/span_id được OpenTelemetry tự động đính kèm vào header khi gọi giữa các service để đảm bảo trace không bị đứt đoạn.</w:t>
             </w:r>
           </w:p>
         </w:tc>
@@ -9492,30 +9146,8 @@
             <w:vAlign w:val="center"/>
           </w:tcPr>
           <w:p>
-            <w:pPr>
-              <w:pStyle w:val="Normal"/>
-              <w:suppressLineNumbers w:val="0"/>
-              <w:bidi w:val="0"/>
-              <w:spacing w:before="0" w:beforeAutospacing="off" w:after="0" w:afterAutospacing="off" w:line="259" w:lineRule="auto"/>
-              <w:ind w:left="90" w:right="0" w:firstLine="0"/>
-              <w:jc w:val="center"/>
-              <w:rPr>
-                <w:rFonts w:ascii="Times New Roman" w:hAnsi="Times New Roman" w:eastAsia="Times New Roman" w:cs="Times New Roman"/>
-                <w:color w:val="auto"/>
-                <w:sz w:val="24"/>
-                <w:szCs w:val="24"/>
-                <w:lang w:val="en-US" w:eastAsia="en-US" w:bidi="ar-SA"/>
-              </w:rPr>
-            </w:pPr>
-            <w:r>
-              <w:rPr>
-                <w:rFonts w:ascii="Times New Roman" w:hAnsi="Times New Roman" w:eastAsia="Times New Roman" w:cs="Times New Roman"/>
-                <w:color w:val="auto"/>
-                <w:sz w:val="24"/>
-                <w:szCs w:val="24"/>
-                <w:lang w:val="en-US" w:eastAsia="en-US" w:bidi="ar-SA"/>
-              </w:rPr>
-              <w:t>Thời gian ghi nhận sự kiện theo chuẩn ISO 8601 UTC.</w:t>
+            <w:r>
+              <w:t>[Tự động - SDK] Thời gian ghi nhận sự kiện theo chuẩn ISO 8601 UTC.</w:t>
             </w:r>
           </w:p>
         </w:tc>
@@ -9592,90 +9224,8 @@
             <w:vAlign w:val="center"/>
           </w:tcPr>
           <w:p>
-            <w:pPr>
-              <w:pStyle w:val="Normal"/>
-              <w:suppressLineNumbers w:val="0"/>
-              <w:bidi w:val="0"/>
-              <w:spacing w:before="0" w:beforeAutospacing="off" w:after="0" w:afterAutospacing="off" w:line="259" w:lineRule="auto"/>
-              <w:ind w:left="90" w:right="0" w:firstLine="0"/>
-              <w:jc w:val="center"/>
-              <w:rPr>
-                <w:rFonts w:ascii="Times New Roman" w:hAnsi="Times New Roman" w:eastAsia="Times New Roman" w:cs="Times New Roman"/>
-                <w:color w:val="auto"/>
-                <w:sz w:val="24"/>
-                <w:szCs w:val="24"/>
-                <w:lang w:val="en-US" w:eastAsia="en-US" w:bidi="ar-SA"/>
-              </w:rPr>
-            </w:pPr>
-            <w:r>
-              <w:rPr>
-                <w:rFonts w:ascii="Times New Roman" w:hAnsi="Times New Roman" w:eastAsia="Times New Roman" w:cs="Times New Roman"/>
-                <w:color w:val="auto"/>
-                <w:sz w:val="24"/>
-                <w:szCs w:val="24"/>
-                <w:lang w:val="en-US" w:eastAsia="en-US" w:bidi="ar-SA"/>
-              </w:rPr>
-              <w:t>Mức độ nghiêm trọng của log theo chuẩn OTLP (</w:t>
-            </w:r>
-            <w:r>
-              <w:rPr>
-                <w:rFonts w:ascii="Times New Roman" w:hAnsi="Times New Roman" w:eastAsia="Times New Roman" w:cs="Times New Roman"/>
-                <w:color w:val="auto"/>
-                <w:sz w:val="24"/>
-                <w:szCs w:val="24"/>
-                <w:lang w:val="en-US" w:eastAsia="en-US" w:bidi="ar-SA"/>
-              </w:rPr>
-              <w:t>Information</w:t>
-            </w:r>
-            <w:r>
-              <w:rPr>
-                <w:rFonts w:ascii="Times New Roman" w:hAnsi="Times New Roman" w:eastAsia="Times New Roman" w:cs="Times New Roman"/>
-                <w:color w:val="auto"/>
-                <w:sz w:val="24"/>
-                <w:szCs w:val="24"/>
-                <w:lang w:val="en-US" w:eastAsia="en-US" w:bidi="ar-SA"/>
-              </w:rPr>
-              <w:t xml:space="preserve">, </w:t>
-            </w:r>
-            <w:r>
-              <w:rPr>
-                <w:rFonts w:ascii="Times New Roman" w:hAnsi="Times New Roman" w:eastAsia="Times New Roman" w:cs="Times New Roman"/>
-                <w:color w:val="auto"/>
-                <w:sz w:val="24"/>
-                <w:szCs w:val="24"/>
-                <w:lang w:val="en-US" w:eastAsia="en-US" w:bidi="ar-SA"/>
-              </w:rPr>
-              <w:t>Warning</w:t>
-            </w:r>
-            <w:r>
-              <w:rPr>
-                <w:rFonts w:ascii="Times New Roman" w:hAnsi="Times New Roman" w:eastAsia="Times New Roman" w:cs="Times New Roman"/>
-                <w:color w:val="auto"/>
-                <w:sz w:val="24"/>
-                <w:szCs w:val="24"/>
-                <w:lang w:val="en-US" w:eastAsia="en-US" w:bidi="ar-SA"/>
-              </w:rPr>
-              <w:t xml:space="preserve">, </w:t>
-            </w:r>
-            <w:r>
-              <w:rPr>
-                <w:rFonts w:ascii="Times New Roman" w:hAnsi="Times New Roman" w:eastAsia="Times New Roman" w:cs="Times New Roman"/>
-                <w:color w:val="auto"/>
-                <w:sz w:val="24"/>
-                <w:szCs w:val="24"/>
-                <w:lang w:val="en-US" w:eastAsia="en-US" w:bidi="ar-SA"/>
-              </w:rPr>
-              <w:t>Error</w:t>
-            </w:r>
-            <w:r>
-              <w:rPr>
-                <w:rFonts w:ascii="Times New Roman" w:hAnsi="Times New Roman" w:eastAsia="Times New Roman" w:cs="Times New Roman"/>
-                <w:color w:val="auto"/>
-                <w:sz w:val="24"/>
-                <w:szCs w:val="24"/>
-                <w:lang w:val="en-US" w:eastAsia="en-US" w:bidi="ar-SA"/>
-              </w:rPr>
-              <w:t>).</w:t>
+            <w:r>
+              <w:t>[Tự động - SDK] Mức độ nghiêm trọng của log (Information, Warning, Error), tự động ánh xạ từ ILogger LogLevel sang chuẩn OTLP.</w:t>
             </w:r>
           </w:p>
         </w:tc>
@@ -9752,70 +9302,8 @@
             <w:vAlign w:val="center"/>
           </w:tcPr>
           <w:p>
-            <w:pPr>
-              <w:pStyle w:val="Normal"/>
-              <w:suppressLineNumbers w:val="0"/>
-              <w:bidi w:val="0"/>
-              <w:spacing w:before="0" w:beforeAutospacing="off" w:after="0" w:afterAutospacing="off" w:line="259" w:lineRule="auto"/>
-              <w:ind w:left="90" w:right="0" w:firstLine="0"/>
-              <w:jc w:val="center"/>
-              <w:rPr>
-                <w:rFonts w:ascii="Times New Roman" w:hAnsi="Times New Roman" w:eastAsia="Times New Roman" w:cs="Times New Roman"/>
-                <w:color w:val="auto"/>
-                <w:sz w:val="24"/>
-                <w:szCs w:val="24"/>
-                <w:lang w:val="en-US" w:eastAsia="en-US" w:bidi="ar-SA"/>
-              </w:rPr>
-            </w:pPr>
-            <w:r>
-              <w:rPr>
-                <w:rFonts w:ascii="Times New Roman" w:hAnsi="Times New Roman" w:eastAsia="Times New Roman" w:cs="Times New Roman"/>
-                <w:color w:val="auto"/>
-                <w:sz w:val="24"/>
-                <w:szCs w:val="24"/>
-                <w:lang w:val="en-US" w:eastAsia="en-US" w:bidi="ar-SA"/>
-              </w:rPr>
-              <w:t xml:space="preserve">Tên microservice (định dạng </w:t>
-            </w:r>
-            <w:r>
-              <w:rPr>
-                <w:rFonts w:ascii="Times New Roman" w:hAnsi="Times New Roman" w:eastAsia="Times New Roman" w:cs="Times New Roman"/>
-                <w:color w:val="auto"/>
-                <w:sz w:val="24"/>
-                <w:szCs w:val="24"/>
-                <w:lang w:val="en-US" w:eastAsia="en-US" w:bidi="ar-SA"/>
-              </w:rPr>
-              <w:t>kebab-case</w:t>
-            </w:r>
-            <w:r>
-              <w:rPr>
-                <w:rFonts w:ascii="Times New Roman" w:hAnsi="Times New Roman" w:eastAsia="Times New Roman" w:cs="Times New Roman"/>
-                <w:color w:val="auto"/>
-                <w:sz w:val="24"/>
-                <w:szCs w:val="24"/>
-                <w:lang w:val="en-US" w:eastAsia="en-US" w:bidi="ar-SA"/>
-              </w:rPr>
-              <w:t xml:space="preserve"> kèm hậu tố </w:t>
-            </w:r>
-            <w:r>
-              <w:rPr>
-                <w:rFonts w:ascii="Times New Roman" w:hAnsi="Times New Roman" w:eastAsia="Times New Roman" w:cs="Times New Roman"/>
-                <w:color w:val="auto"/>
-                <w:sz w:val="24"/>
-                <w:szCs w:val="24"/>
-                <w:lang w:val="en-US" w:eastAsia="en-US" w:bidi="ar-SA"/>
-              </w:rPr>
-              <w:t>-svc</w:t>
-            </w:r>
-            <w:r>
-              <w:rPr>
-                <w:rFonts w:ascii="Times New Roman" w:hAnsi="Times New Roman" w:eastAsia="Times New Roman" w:cs="Times New Roman"/>
-                <w:color w:val="auto"/>
-                <w:sz w:val="24"/>
-                <w:szCs w:val="24"/>
-                <w:lang w:val="en-US" w:eastAsia="en-US" w:bidi="ar-SA"/>
-              </w:rPr>
-              <w:t>).</w:t>
+            <w:r>
+              <w:t>[Tự động - SDK] Tên microservice (kebab-case kèm -svc), tự động lấy từ cấu hình appsettings.json hoặc OTEL_SERVICE_NAME.</w:t>
             </w:r>
           </w:p>
         </w:tc>
@@ -9889,90 +9377,8 @@
             <w:vAlign w:val="center"/>
           </w:tcPr>
           <w:p>
-            <w:pPr>
-              <w:pStyle w:val="Normal"/>
-              <w:suppressLineNumbers w:val="0"/>
-              <w:bidi w:val="0"/>
-              <w:spacing w:before="0" w:beforeAutospacing="off" w:after="0" w:afterAutospacing="off" w:line="259" w:lineRule="auto"/>
-              <w:ind w:left="90" w:right="0" w:firstLine="0"/>
-              <w:jc w:val="center"/>
-              <w:rPr>
-                <w:rFonts w:ascii="Times New Roman" w:hAnsi="Times New Roman" w:eastAsia="Times New Roman" w:cs="Times New Roman"/>
-                <w:color w:val="auto"/>
-                <w:sz w:val="24"/>
-                <w:szCs w:val="24"/>
-                <w:lang w:val="en-US" w:eastAsia="en-US" w:bidi="ar-SA"/>
-              </w:rPr>
-            </w:pPr>
-            <w:r>
-              <w:rPr>
-                <w:rFonts w:ascii="Times New Roman" w:hAnsi="Times New Roman" w:eastAsia="Times New Roman" w:cs="Times New Roman"/>
-                <w:color w:val="auto"/>
-                <w:sz w:val="24"/>
-                <w:szCs w:val="24"/>
-                <w:lang w:val="en-US" w:eastAsia="en-US" w:bidi="ar-SA"/>
-              </w:rPr>
-              <w:t>Môi trường triển khai (</w:t>
-            </w:r>
-            <w:r>
-              <w:rPr>
-                <w:rFonts w:ascii="Times New Roman" w:hAnsi="Times New Roman" w:eastAsia="Times New Roman" w:cs="Times New Roman"/>
-                <w:color w:val="auto"/>
-                <w:sz w:val="24"/>
-                <w:szCs w:val="24"/>
-                <w:lang w:val="en-US" w:eastAsia="en-US" w:bidi="ar-SA"/>
-              </w:rPr>
-              <w:t>production</w:t>
-            </w:r>
-            <w:r>
-              <w:rPr>
-                <w:rFonts w:ascii="Times New Roman" w:hAnsi="Times New Roman" w:eastAsia="Times New Roman" w:cs="Times New Roman"/>
-                <w:color w:val="auto"/>
-                <w:sz w:val="24"/>
-                <w:szCs w:val="24"/>
-                <w:lang w:val="en-US" w:eastAsia="en-US" w:bidi="ar-SA"/>
-              </w:rPr>
-              <w:t xml:space="preserve">, </w:t>
-            </w:r>
-            <w:r>
-              <w:rPr>
-                <w:rFonts w:ascii="Times New Roman" w:hAnsi="Times New Roman" w:eastAsia="Times New Roman" w:cs="Times New Roman"/>
-                <w:color w:val="auto"/>
-                <w:sz w:val="24"/>
-                <w:szCs w:val="24"/>
-                <w:lang w:val="en-US" w:eastAsia="en-US" w:bidi="ar-SA"/>
-              </w:rPr>
-              <w:t>staging</w:t>
-            </w:r>
-            <w:r>
-              <w:rPr>
-                <w:rFonts w:ascii="Times New Roman" w:hAnsi="Times New Roman" w:eastAsia="Times New Roman" w:cs="Times New Roman"/>
-                <w:color w:val="auto"/>
-                <w:sz w:val="24"/>
-                <w:szCs w:val="24"/>
-                <w:lang w:val="en-US" w:eastAsia="en-US" w:bidi="ar-SA"/>
-              </w:rPr>
-              <w:t xml:space="preserve">, </w:t>
-            </w:r>
-            <w:r>
-              <w:rPr>
-                <w:rFonts w:ascii="Times New Roman" w:hAnsi="Times New Roman" w:eastAsia="Times New Roman" w:cs="Times New Roman"/>
-                <w:color w:val="auto"/>
-                <w:sz w:val="24"/>
-                <w:szCs w:val="24"/>
-                <w:lang w:val="en-US" w:eastAsia="en-US" w:bidi="ar-SA"/>
-              </w:rPr>
-              <w:t>dev</w:t>
-            </w:r>
-            <w:r>
-              <w:rPr>
-                <w:rFonts w:ascii="Times New Roman" w:hAnsi="Times New Roman" w:eastAsia="Times New Roman" w:cs="Times New Roman"/>
-                <w:color w:val="auto"/>
-                <w:sz w:val="24"/>
-                <w:szCs w:val="24"/>
-                <w:lang w:val="en-US" w:eastAsia="en-US" w:bidi="ar-SA"/>
-              </w:rPr>
-              <w:t>).</w:t>
+            <w:r>
+              <w:t>[Tự động - SDK] Môi trường triển khai, tự động lấy từ biến môi trường ASPNETCORE_ENVIRONMENT.</w:t>
             </w:r>
           </w:p>
         </w:tc>
@@ -10049,30 +9455,8 @@
             <w:vAlign w:val="center"/>
           </w:tcPr>
           <w:p>
-            <w:pPr>
-              <w:pStyle w:val="Normal"/>
-              <w:suppressLineNumbers w:val="0"/>
-              <w:bidi w:val="0"/>
-              <w:spacing w:before="0" w:beforeAutospacing="off" w:after="0" w:afterAutospacing="off" w:line="259" w:lineRule="auto"/>
-              <w:ind w:left="90" w:right="0" w:firstLine="0"/>
-              <w:jc w:val="center"/>
-              <w:rPr>
-                <w:rFonts w:ascii="Times New Roman" w:hAnsi="Times New Roman" w:eastAsia="Times New Roman" w:cs="Times New Roman"/>
-                <w:color w:val="auto"/>
-                <w:sz w:val="24"/>
-                <w:szCs w:val="24"/>
-                <w:lang w:val="en-US" w:eastAsia="en-US" w:bidi="ar-SA"/>
-              </w:rPr>
-            </w:pPr>
-            <w:r>
-              <w:rPr>
-                <w:rFonts w:ascii="Times New Roman" w:hAnsi="Times New Roman" w:eastAsia="Times New Roman" w:cs="Times New Roman"/>
-                <w:color w:val="auto"/>
-                <w:sz w:val="24"/>
-                <w:szCs w:val="24"/>
-                <w:lang w:val="en-US" w:eastAsia="en-US" w:bidi="ar-SA"/>
-              </w:rPr>
-              <w:t>Mã định danh truy vết phân tán xuyên suốt các service.</w:t>
+            <w:r>
+              <w:t>[Tự động - OTel] Mã định danh truy vết phân tán xuyên suốt các service, tự động trích xuất từ W3C traceparent hoặc sinh mới.</w:t>
             </w:r>
           </w:p>
         </w:tc>
@@ -10149,30 +9533,8 @@
             <w:vAlign w:val="center"/>
           </w:tcPr>
           <w:p>
-            <w:pPr>
-              <w:pStyle w:val="Normal"/>
-              <w:suppressLineNumbers w:val="0"/>
-              <w:bidi w:val="0"/>
-              <w:spacing w:before="0" w:beforeAutospacing="off" w:after="0" w:afterAutospacing="off" w:line="259" w:lineRule="auto"/>
-              <w:ind w:left="90" w:right="0" w:firstLine="0"/>
-              <w:jc w:val="center"/>
-              <w:rPr>
-                <w:rFonts w:ascii="Times New Roman" w:hAnsi="Times New Roman" w:eastAsia="Times New Roman" w:cs="Times New Roman"/>
-                <w:color w:val="auto"/>
-                <w:sz w:val="24"/>
-                <w:szCs w:val="24"/>
-                <w:lang w:val="en-US" w:eastAsia="en-US" w:bidi="ar-SA"/>
-              </w:rPr>
-            </w:pPr>
-            <w:r>
-              <w:rPr>
-                <w:rFonts w:ascii="Times New Roman" w:hAnsi="Times New Roman" w:eastAsia="Times New Roman" w:cs="Times New Roman"/>
-                <w:color w:val="auto"/>
-                <w:sz w:val="24"/>
-                <w:szCs w:val="24"/>
-                <w:lang w:val="en-US" w:eastAsia="en-US" w:bidi="ar-SA"/>
-              </w:rPr>
-              <w:t>Mã định danh công đoạn thực thi hiện tại.</w:t>
+            <w:r>
+              <w:t>[Tự động - OTel] Mã định danh công đoạn thực thi hiện tại, tự động lấy từ Activity.Current.</w:t>
             </w:r>
           </w:p>
         </w:tc>
@@ -10249,30 +9611,8 @@
             <w:vAlign w:val="center"/>
           </w:tcPr>
           <w:p>
-            <w:pPr>
-              <w:pStyle w:val="Normal"/>
-              <w:suppressLineNumbers w:val="0"/>
-              <w:bidi w:val="0"/>
-              <w:spacing w:before="0" w:beforeAutospacing="off" w:after="0" w:afterAutospacing="off" w:line="259" w:lineRule="auto"/>
-              <w:ind w:left="90" w:right="0" w:firstLine="0"/>
-              <w:jc w:val="center"/>
-              <w:rPr>
-                <w:rFonts w:ascii="Times New Roman" w:hAnsi="Times New Roman" w:eastAsia="Times New Roman" w:cs="Times New Roman"/>
-                <w:color w:val="auto"/>
-                <w:sz w:val="24"/>
-                <w:szCs w:val="24"/>
-                <w:lang w:val="en-US" w:eastAsia="en-US" w:bidi="ar-SA"/>
-              </w:rPr>
-            </w:pPr>
-            <w:r>
-              <w:rPr>
-                <w:rFonts w:ascii="Times New Roman" w:hAnsi="Times New Roman" w:eastAsia="Times New Roman" w:cs="Times New Roman"/>
-                <w:color w:val="auto"/>
-                <w:sz w:val="24"/>
-                <w:szCs w:val="24"/>
-                <w:lang w:val="en-US" w:eastAsia="en-US" w:bidi="ar-SA"/>
-              </w:rPr>
-              <w:t>Mã đối soát request từ Client/Gateway gửi vào.</w:t>
+            <w:r>
+              <w:t>[Tự động - SDK] Mã đối soát request từ Client/Gateway gửi vào, tự động trích xuất từ Header X-Correlation-ID hoặc sinh mới.</w:t>
             </w:r>
           </w:p>
         </w:tc>
@@ -10346,30 +9686,40 @@
             <w:vAlign w:val="center"/>
           </w:tcPr>
           <w:p>
-            <w:pPr>
-              <w:pStyle w:val="Normal"/>
-              <w:suppressLineNumbers w:val="0"/>
-              <w:bidi w:val="0"/>
-              <w:spacing w:before="0" w:beforeAutospacing="off" w:after="0" w:afterAutospacing="off" w:line="259" w:lineRule="auto"/>
-              <w:ind w:left="90" w:right="0" w:firstLine="0"/>
-              <w:jc w:val="center"/>
-              <w:rPr>
-                <w:rFonts w:ascii="Times New Roman" w:hAnsi="Times New Roman" w:eastAsia="Times New Roman" w:cs="Times New Roman"/>
-                <w:color w:val="auto"/>
-                <w:sz w:val="24"/>
-                <w:szCs w:val="24"/>
-                <w:lang w:val="en-US" w:eastAsia="en-US" w:bidi="ar-SA"/>
-              </w:rPr>
-            </w:pPr>
-            <w:r>
-              <w:rPr>
-                <w:rFonts w:ascii="Times New Roman" w:hAnsi="Times New Roman" w:eastAsia="Times New Roman" w:cs="Times New Roman"/>
-                <w:color w:val="auto"/>
-                <w:sz w:val="24"/>
-                <w:szCs w:val="24"/>
-                <w:lang w:val="en-US" w:eastAsia="en-US" w:bidi="ar-SA"/>
-              </w:rPr>
-              <w:t>Nội dung thông điệp mô tả sự kiện.</w:t>
+            <w:r>
+              <w:t>[Dev truyền vào] Nội dung thông điệp mô tả sự kiện qua lệnh gọi _logger.LogX(...).</w:t>
+            </w:r>
+          </w:p>
+        </w:tc>
+      </w:tr>
+      <w:tr>
+        <w:tc>
+          <w:tcPr>
+            <w:tcW w:type="dxa" w:w="2595"/>
+          </w:tcPr>
+          <w:p>
+            <w:r>
+              <w:t>{custom_fields}</w:t>
+            </w:r>
+          </w:p>
+        </w:tc>
+        <w:tc>
+          <w:tcPr>
+            <w:tcW w:type="dxa" w:w="2445"/>
+          </w:tcPr>
+          <w:p>
+            <w:r>
+              <w:t>Tùy chọn</w:t>
+            </w:r>
+          </w:p>
+        </w:tc>
+        <w:tc>
+          <w:tcPr>
+            <w:tcW w:type="dxa" w:w="8370"/>
+          </w:tcPr>
+          <w:p>
+            <w:r>
+              <w:t>[Dev truyền vào] Các biến ngữ cảnh nghiệp vụ (ví dụ: order_id, customer_id). Bắt buộc đặt tên snake_case và tuân thủ che chắn dữ liệu nhạy cảm PII.</w:t>
             </w:r>
           </w:p>
         </w:tc>
@@ -12027,22 +11377,10 @@
             <w:tcMar/>
           </w:tcPr>
           <w:p>
-            <w:pPr>
-              <w:spacing w:after="120"/>
-              <w:ind w:left="249" w:firstLine="0"/>
-              <w:jc w:val="left"/>
-            </w:pPr>
-            <w:r>
-              <w:rPr>
-                <w:lang w:val="en-US"/>
-              </w:rPr>
-              <w:t xml:space="preserve">HTTP request </w:t>
-            </w:r>
-            <w:r>
-              <w:rPr>
-                <w:lang w:val="en-US"/>
-              </w:rPr>
-              <w:t>vào</w:t>
+            <w:r>
+              <w:t>HTTP request vào</w:t>
+              <w:br/>
+              <w:t>[OTel tự động 100%]</w:t>
             </w:r>
           </w:p>
         </w:tc>
@@ -12146,40 +11484,10 @@
             <w:tcMar/>
           </w:tcPr>
           <w:p>
-            <w:pPr>
-              <w:spacing w:after="120"/>
-              <w:ind w:left="249" w:firstLine="0"/>
-              <w:jc w:val="left"/>
-            </w:pPr>
-            <w:r>
-              <w:rPr>
-                <w:lang w:val="en-US"/>
-              </w:rPr>
-              <w:t>Gọi</w:t>
-            </w:r>
-            <w:r>
-              <w:rPr>
-                <w:lang w:val="en-US"/>
-              </w:rPr>
-              <w:t xml:space="preserve"> HTTP </w:t>
-            </w:r>
-            <w:r>
-              <w:rPr>
-                <w:lang w:val="en-US"/>
-              </w:rPr>
-              <w:t>ra</w:t>
-            </w:r>
-            <w:r>
-              <w:rPr>
-                <w:lang w:val="en-US"/>
-              </w:rPr>
-              <w:t xml:space="preserve"> </w:t>
-            </w:r>
-            <w:r>
-              <w:rPr>
-                <w:lang w:val="en-US"/>
-              </w:rPr>
-              <w:t>ngoài</w:t>
+            <w:r>
+              <w:t>Gọi HTTP ra ngoài</w:t>
+              <w:br/>
+              <w:t>[OTel tự động 100%]</w:t>
             </w:r>
           </w:p>
         </w:tc>
@@ -12219,34 +11527,10 @@
             <w:tcMar/>
           </w:tcPr>
           <w:p>
-            <w:pPr>
-              <w:spacing w:after="120"/>
-              <w:ind w:left="249" w:firstLine="0"/>
-              <w:jc w:val="left"/>
-            </w:pPr>
-            <w:r>
-              <w:rPr>
-                <w:lang w:val="en-US"/>
-              </w:rPr>
-              <w:t>Truy</w:t>
-            </w:r>
-            <w:r>
-              <w:rPr>
-                <w:lang w:val="en-US"/>
-              </w:rPr>
-              <w:t xml:space="preserve"> </w:t>
-            </w:r>
-            <w:r>
-              <w:rPr>
-                <w:lang w:val="en-US"/>
-              </w:rPr>
-              <w:t>vấn</w:t>
-            </w:r>
-            <w:r>
-              <w:rPr>
-                <w:lang w:val="en-US"/>
-              </w:rPr>
-              <w:t xml:space="preserve"> database</w:t>
+            <w:r>
+              <w:t>Truy vấn database</w:t>
+              <w:br/>
+              <w:t>[OTel tự động 100%]</w:t>
             </w:r>
           </w:p>
         </w:tc>
@@ -12347,13 +11631,10 @@
             <w:tcMar/>
           </w:tcPr>
           <w:p>
-            <w:pPr>
-              <w:spacing w:after="120"/>
-              <w:ind w:left="249" w:firstLine="0"/>
-              <w:jc w:val="left"/>
-            </w:pPr>
             <w:r>
               <w:t>Publish/consume message</w:t>
+              <w:br/>
+              <w:t>[OTel tự động 100%]</w:t>
             </w:r>
           </w:p>
         </w:tc>
@@ -12409,70 +11690,10 @@
             <w:tcMar/>
           </w:tcPr>
           <w:p>
-            <w:pPr>
-              <w:spacing w:after="120"/>
-              <w:ind w:left="249" w:firstLine="0"/>
-              <w:jc w:val="left"/>
-            </w:pPr>
-            <w:r>
-              <w:rPr>
-                <w:lang w:val="en-US"/>
-              </w:rPr>
-              <w:t>Xử</w:t>
-            </w:r>
-            <w:r>
-              <w:rPr>
-                <w:lang w:val="en-US"/>
-              </w:rPr>
-              <w:t xml:space="preserve"> </w:t>
-            </w:r>
-            <w:r>
-              <w:rPr>
-                <w:lang w:val="en-US"/>
-              </w:rPr>
-              <w:t>lý</w:t>
-            </w:r>
-            <w:r>
-              <w:rPr>
-                <w:lang w:val="en-US"/>
-              </w:rPr>
-              <w:t xml:space="preserve"> </w:t>
-            </w:r>
-            <w:r>
-              <w:rPr>
-                <w:lang w:val="en-US"/>
-              </w:rPr>
-              <w:t>nghiệp</w:t>
-            </w:r>
-            <w:r>
-              <w:rPr>
-                <w:lang w:val="en-US"/>
-              </w:rPr>
-              <w:t xml:space="preserve"> </w:t>
-            </w:r>
-            <w:r>
-              <w:rPr>
-                <w:lang w:val="en-US"/>
-              </w:rPr>
-              <w:t>vụ</w:t>
-            </w:r>
-            <w:r>
-              <w:rPr>
-                <w:lang w:val="en-US"/>
-              </w:rPr>
-              <w:t xml:space="preserve"> </w:t>
-            </w:r>
-            <w:r>
-              <w:rPr>
-                <w:lang w:val="en-US"/>
-              </w:rPr>
-              <w:t>dài</w:t>
-            </w:r>
-            <w:r>
-              <w:rPr>
-                <w:lang w:val="en-US"/>
-              </w:rPr>
-              <w:t xml:space="preserve"> &gt; 200ms</w:t>
+            <w:r>
+              <w:t>Xử lý nghiệp vụ dài &gt; 200ms</w:t>
+              <w:br/>
+              <w:t>[Developer tự khởi tạo]</w:t>
             </w:r>
           </w:p>
         </w:tc>

</xml_diff>

<commit_message>
docs: use standard English grammar for glossary terms Trace ID, Span ID and Label
</commit_message>
<xml_diff>
--- a/docs/ISC_QuyDinh_Observability_v1_0.docx
+++ b/docs/ISC_QuyDinh_Observability_v1_0.docx
@@ -1840,27 +1840,8 @@
             <w:tcMar/>
           </w:tcPr>
           <w:p>
-            <w:pPr>
-              <w:spacing w:after="120"/>
-              <w:jc w:val="left"/>
-            </w:pPr>
-            <w:r>
-              <w:rPr>
-                <w:lang w:val="en-US"/>
-              </w:rPr>
-              <w:t>trace_id</w:t>
-            </w:r>
-            <w:r>
-              <w:rPr>
-                <w:lang w:val="en-US"/>
-              </w:rPr>
-              <w:t xml:space="preserve"> / </w:t>
-            </w:r>
-            <w:r>
-              <w:rPr>
-                <w:lang w:val="en-US"/>
-              </w:rPr>
-              <w:t>span_id</w:t>
+            <w:r>
+              <w:t>Trace ID / Span ID</w:t>
             </w:r>
           </w:p>
         </w:tc>
@@ -1877,7 +1858,43 @@
           </w:tcPr>
           <w:p>
             <w:r>
-              <w:t>Mã định danh của trace và từng span do OpenTelemetry &amp; SDK tự động sinh/truyền dẫn (W3C traceparent). Developer không cần tự sinh hay truyền thủ công.</w:t>
+              <w:t>Mã định danh của trace và của từng span, dùng để ghép log và span về đúng một request.</w:t>
+            </w:r>
+          </w:p>
+        </w:tc>
+      </w:tr>
+      <w:tr>
+        <w:tc>
+          <w:tcPr>
+            <w:tcW w:w="3515" w:type="dxa"/>
+            <w:tcBorders>
+              <w:top w:val="single" w:color="auto" w:sz="4" w:space="0"/>
+              <w:left w:val="single" w:color="auto" w:sz="4" w:space="0"/>
+              <w:bottom w:val="single" w:color="auto" w:sz="4" w:space="0"/>
+              <w:right w:val="single" w:color="auto" w:sz="4" w:space="0"/>
+            </w:tcBorders>
+            <w:tcMar/>
+          </w:tcPr>
+          <w:p>
+            <w:r>
+              <w:t>Trace context</w:t>
+            </w:r>
+          </w:p>
+        </w:tc>
+        <w:tc>
+          <w:tcPr>
+            <w:tcW w:w="9895" w:type="dxa"/>
+            <w:tcBorders>
+              <w:top w:val="single" w:color="auto" w:sz="4" w:space="0"/>
+              <w:left w:val="single" w:color="auto" w:sz="4" w:space="0"/>
+              <w:bottom w:val="single" w:color="auto" w:sz="4" w:space="0"/>
+              <w:right w:val="single" w:color="auto" w:sz="4" w:space="0"/>
+            </w:tcBorders>
+            <w:tcMar/>
+          </w:tcPr>
+          <w:p>
+            <w:r>
+              <w:t>Thông tin Trace ID / Span ID được truyền kèm lời gọi giữa các service để trace không bị đứt đoạn.</w:t>
             </w:r>
           </w:p>
         </w:tc>
@@ -1900,46 +1917,6 @@
               <w:jc w:val="left"/>
             </w:pPr>
             <w:r>
-              <w:t>Trace context</w:t>
-            </w:r>
-          </w:p>
-        </w:tc>
-        <w:tc>
-          <w:tcPr>
-            <w:tcW w:w="9895" w:type="dxa"/>
-            <w:tcBorders>
-              <w:top w:val="single" w:color="auto" w:sz="4" w:space="0"/>
-              <w:left w:val="single" w:color="auto" w:sz="4" w:space="0"/>
-              <w:bottom w:val="single" w:color="auto" w:sz="4" w:space="0"/>
-              <w:right w:val="single" w:color="auto" w:sz="4" w:space="0"/>
-            </w:tcBorders>
-            <w:tcMar/>
-          </w:tcPr>
-          <w:p>
-            <w:r>
-              <w:t>Thông tin trace_id/span_id được OpenTelemetry tự động đính kèm vào header khi gọi giữa các service để đảm bảo trace không bị đứt đoạn.</w:t>
-            </w:r>
-          </w:p>
-        </w:tc>
-      </w:tr>
-      <w:tr>
-        <w:tc>
-          <w:tcPr>
-            <w:tcW w:w="3515" w:type="dxa"/>
-            <w:tcBorders>
-              <w:top w:val="single" w:color="auto" w:sz="4" w:space="0"/>
-              <w:left w:val="single" w:color="auto" w:sz="4" w:space="0"/>
-              <w:bottom w:val="single" w:color="auto" w:sz="4" w:space="0"/>
-              <w:right w:val="single" w:color="auto" w:sz="4" w:space="0"/>
-            </w:tcBorders>
-            <w:tcMar/>
-          </w:tcPr>
-          <w:p>
-            <w:pPr>
-              <w:spacing w:after="120"/>
-              <w:jc w:val="left"/>
-            </w:pPr>
-            <w:r>
               <w:t>Metrics</w:t>
             </w:r>
           </w:p>
@@ -2217,16 +2194,8 @@
             <w:tcMar/>
           </w:tcPr>
           <w:p>
-            <w:pPr>
-              <w:pStyle w:val="Normal"/>
-              <w:spacing w:after="120"/>
-              <w:jc w:val="left"/>
-            </w:pPr>
-            <w:r>
-              <w:rPr>
-                <w:lang w:val="en-US"/>
-              </w:rPr>
-              <w:t>Attributes (Labels)</w:t>
+            <w:r>
+              <w:t>Label</w:t>
             </w:r>
           </w:p>
         </w:tc>
@@ -2242,226 +2211,8 @@
             <w:tcMar/>
           </w:tcPr>
           <w:p>
-            <w:pPr>
-              <w:spacing w:after="120"/>
-              <w:ind w:left="0" w:firstLine="0"/>
-              <w:jc w:val="left"/>
-            </w:pPr>
-            <w:r>
-              <w:rPr>
-                <w:lang w:val="en-US"/>
-              </w:rPr>
-              <w:t>Nhãn</w:t>
-            </w:r>
-            <w:r>
-              <w:rPr>
-                <w:lang w:val="en-US"/>
-              </w:rPr>
-              <w:t xml:space="preserve"> </w:t>
-            </w:r>
-            <w:r>
-              <w:rPr>
-                <w:lang w:val="en-US"/>
-              </w:rPr>
-              <w:t>phân</w:t>
-            </w:r>
-            <w:r>
-              <w:rPr>
-                <w:lang w:val="en-US"/>
-              </w:rPr>
-              <w:t xml:space="preserve"> </w:t>
-            </w:r>
-            <w:r>
-              <w:rPr>
-                <w:lang w:val="en-US"/>
-              </w:rPr>
-              <w:t>loại</w:t>
-            </w:r>
-            <w:r>
-              <w:rPr>
-                <w:lang w:val="en-US"/>
-              </w:rPr>
-              <w:t xml:space="preserve"> </w:t>
-            </w:r>
-            <w:r>
-              <w:rPr>
-                <w:lang w:val="en-US"/>
-              </w:rPr>
-              <w:t>gắn</w:t>
-            </w:r>
-            <w:r>
-              <w:rPr>
-                <w:lang w:val="en-US"/>
-              </w:rPr>
-              <w:t xml:space="preserve"> </w:t>
-            </w:r>
-            <w:r>
-              <w:rPr>
-                <w:lang w:val="en-US"/>
-              </w:rPr>
-              <w:t>kèm</w:t>
-            </w:r>
-            <w:r>
-              <w:rPr>
-                <w:lang w:val="en-US"/>
-              </w:rPr>
-              <w:t xml:space="preserve"> metric, trace, log (</w:t>
-            </w:r>
-            <w:r>
-              <w:rPr>
-                <w:lang w:val="en-US"/>
-              </w:rPr>
-              <w:t>ví</w:t>
-            </w:r>
-            <w:r>
-              <w:rPr>
-                <w:lang w:val="en-US"/>
-              </w:rPr>
-              <w:t xml:space="preserve"> </w:t>
-            </w:r>
-            <w:r>
-              <w:rPr>
-                <w:lang w:val="en-US"/>
-              </w:rPr>
-              <w:t>dụ</w:t>
-            </w:r>
-            <w:r>
-              <w:rPr>
-                <w:lang w:val="en-US"/>
-              </w:rPr>
-              <w:t xml:space="preserve">: </w:t>
-            </w:r>
-            <w:r>
-              <w:rPr>
-                <w:lang w:val="en-US"/>
-              </w:rPr>
-              <w:t>theo</w:t>
-            </w:r>
-            <w:r>
-              <w:rPr>
-                <w:lang w:val="en-US"/>
-              </w:rPr>
-              <w:t xml:space="preserve"> </w:t>
-            </w:r>
-            <w:r>
-              <w:rPr>
-                <w:lang w:val="en-US"/>
-              </w:rPr>
-              <w:t>service_name</w:t>
-            </w:r>
-            <w:r>
-              <w:rPr>
-                <w:lang w:val="en-US"/>
-              </w:rPr>
-              <w:t xml:space="preserve"> </w:t>
-            </w:r>
-            <w:r>
-              <w:rPr>
-                <w:lang w:val="en-US"/>
-              </w:rPr>
-              <w:t>hoặc</w:t>
-            </w:r>
-            <w:r>
-              <w:rPr>
-                <w:lang w:val="en-US"/>
-              </w:rPr>
-              <w:t xml:space="preserve"> </w:t>
-            </w:r>
-            <w:r>
-              <w:rPr>
-                <w:lang w:val="en-US"/>
-              </w:rPr>
-              <w:t>theo</w:t>
-            </w:r>
-            <w:r>
-              <w:rPr>
-                <w:lang w:val="en-US"/>
-              </w:rPr>
-              <w:t xml:space="preserve"> route). Trong </w:t>
-            </w:r>
-            <w:r>
-              <w:rPr>
-                <w:lang w:val="en-US"/>
-              </w:rPr>
-              <w:t>chuẩn</w:t>
-            </w:r>
-            <w:r>
-              <w:rPr>
-                <w:lang w:val="en-US"/>
-              </w:rPr>
-              <w:t xml:space="preserve"> </w:t>
-            </w:r>
-            <w:r>
-              <w:rPr>
-                <w:lang w:val="en-US"/>
-              </w:rPr>
-              <w:t>OpenTelemetry</w:t>
-            </w:r>
-            <w:r>
-              <w:rPr>
-                <w:lang w:val="en-US"/>
-              </w:rPr>
-              <w:t xml:space="preserve"> </w:t>
-            </w:r>
-            <w:r>
-              <w:rPr>
-                <w:lang w:val="en-US"/>
-              </w:rPr>
-              <w:t>gọi</w:t>
-            </w:r>
-            <w:r>
-              <w:rPr>
-                <w:lang w:val="en-US"/>
-              </w:rPr>
-              <w:t xml:space="preserve"> </w:t>
-            </w:r>
-            <w:r>
-              <w:rPr>
-                <w:lang w:val="en-US"/>
-              </w:rPr>
-              <w:t>là</w:t>
-            </w:r>
-            <w:r>
-              <w:rPr>
-                <w:lang w:val="en-US"/>
-              </w:rPr>
-              <w:t xml:space="preserve"> Attributes, </w:t>
-            </w:r>
-            <w:r>
-              <w:rPr>
-                <w:lang w:val="en-US"/>
-              </w:rPr>
-              <w:t>trong</w:t>
-            </w:r>
-            <w:r>
-              <w:rPr>
-                <w:lang w:val="en-US"/>
-              </w:rPr>
-              <w:t xml:space="preserve"> Prometheus </w:t>
-            </w:r>
-            <w:r>
-              <w:rPr>
-                <w:lang w:val="en-US"/>
-              </w:rPr>
-              <w:t>gọi</w:t>
-            </w:r>
-            <w:r>
-              <w:rPr>
-                <w:lang w:val="en-US"/>
-              </w:rPr>
-              <w:t xml:space="preserve"> </w:t>
-            </w:r>
-            <w:r>
-              <w:rPr>
-                <w:lang w:val="en-US"/>
-              </w:rPr>
-              <w:t>là</w:t>
-            </w:r>
-            <w:r>
-              <w:rPr>
-                <w:lang w:val="en-US"/>
-              </w:rPr>
-              <w:t xml:space="preserve"> Labels.</w:t>
+            <w:r>
+              <w:t>Nhãn phân loại gắn kèm metric, trace hoặc log (ví dụ: theo service hoặc theo route) phục vụ tìm kiếm và lọc dữ liệu.</w:t>
             </w:r>
           </w:p>
         </w:tc>
@@ -16316,58 +16067,8 @@
             <w:tcMar/>
           </w:tcPr>
           <w:p>
-            <w:pPr>
-              <w:spacing w:after="120"/>
-              <w:ind w:left="66" w:firstLine="0"/>
-              <w:jc w:val="left"/>
-            </w:pPr>
-            <w:r>
-              <w:rPr>
-                <w:lang w:val="en-US"/>
-              </w:rPr>
-              <w:t xml:space="preserve">APM, </w:t>
-            </w:r>
-            <w:r>
-              <w:rPr>
-                <w:lang w:val="en-US"/>
-              </w:rPr>
-              <w:t>truy</w:t>
-            </w:r>
-            <w:r>
-              <w:rPr>
-                <w:lang w:val="en-US"/>
-              </w:rPr>
-              <w:t xml:space="preserve"> </w:t>
-            </w:r>
-            <w:r>
-              <w:rPr>
-                <w:lang w:val="en-US"/>
-              </w:rPr>
-              <w:t>vết</w:t>
-            </w:r>
-            <w:r>
-              <w:rPr>
-                <w:lang w:val="en-US"/>
-              </w:rPr>
-              <w:t xml:space="preserve"> </w:t>
-            </w:r>
-            <w:r>
-              <w:rPr>
-                <w:lang w:val="en-US"/>
-              </w:rPr>
-              <w:t>theo</w:t>
-            </w:r>
-            <w:r>
-              <w:rPr>
-                <w:lang w:val="en-US"/>
-              </w:rPr>
-              <w:t xml:space="preserve"> </w:t>
-            </w:r>
-            <w:r>
-              <w:rPr>
-                <w:lang w:val="en-US"/>
-              </w:rPr>
-              <w:t>trace_id</w:t>
+            <w:r>
+              <w:t>APM, truy vết theo Trace ID</w:t>
             </w:r>
           </w:p>
         </w:tc>
@@ -16502,16 +16203,8 @@
             <w:tcMar/>
           </w:tcPr>
           <w:p>
-            <w:pPr>
-              <w:spacing w:after="120"/>
-              <w:ind w:left="66" w:firstLine="0"/>
-              <w:jc w:val="left"/>
-            </w:pPr>
-            <w:r>
-              <w:rPr>
-                <w:lang w:val="en-US"/>
-              </w:rPr>
-              <w:t>Giám sát metric observability.sdk.active = 1, tỷ lệ truyền trace_id và đối chiếu đủ 3 trụ cột (Logs, Traces, Metrics) tại Quality Gate 2 (Mức độ: BLOCKER).</w:t>
+            <w:r>
+              <w:t>Giám sát metric observability.sdk.active = 1, tỷ lệ truyền Trace ID và đối chiếu đủ 3 trụ cột (Logs, Traces, Metrics) tại Quality Gate 2 (Mức độ: BLOCKER).</w:t>
             </w:r>
           </w:p>
         </w:tc>
@@ -17124,64 +16817,7 @@
         <w:rPr/>
       </w:pPr>
       <w:r>
-        <w:rPr>
-          <w:lang w:val="en-US"/>
-        </w:rPr>
-        <w:t xml:space="preserve">☐ </w:t>
-      </w:r>
-      <w:r>
-        <w:rPr>
-          <w:lang w:val="en-US"/>
-        </w:rPr>
-        <w:t>Mọi</w:t>
-      </w:r>
-      <w:r>
-        <w:rPr>
-          <w:lang w:val="en-US"/>
-        </w:rPr>
-        <w:t xml:space="preserve"> request </w:t>
-      </w:r>
-      <w:r>
-        <w:rPr>
-          <w:lang w:val="en-US"/>
-        </w:rPr>
-        <w:t>mang</w:t>
-      </w:r>
-      <w:r>
-        <w:rPr>
-          <w:lang w:val="en-US"/>
-        </w:rPr>
-        <w:t xml:space="preserve"> </w:t>
-      </w:r>
-      <w:r>
-        <w:rPr>
-          <w:lang w:val="en-US"/>
-        </w:rPr>
-        <w:t>trace_id</w:t>
-      </w:r>
-      <w:r>
-        <w:rPr>
-          <w:lang w:val="en-US"/>
-        </w:rPr>
-        <w:t xml:space="preserve"> </w:t>
-      </w:r>
-      <w:r>
-        <w:rPr>
-          <w:lang w:val="en-US"/>
-        </w:rPr>
-        <w:t>và</w:t>
-      </w:r>
-      <w:r>
-        <w:rPr>
-          <w:lang w:val="en-US"/>
-        </w:rPr>
-        <w:t xml:space="preserve"> </w:t>
-      </w:r>
-      <w:r>
-        <w:rPr>
-          <w:lang w:val="en-US"/>
-        </w:rPr>
-        <w:t>span_id</w:t>
+        <w:t>☐ Mọi request mang Trace ID và Span ID</w:t>
       </w:r>
     </w:p>
     <w:p>
@@ -17194,130 +16830,7 @@
         <w:rPr/>
       </w:pPr>
       <w:r>
-        <w:rPr>
-          <w:lang w:val="en-US"/>
-        </w:rPr>
-        <w:t xml:space="preserve">☐ </w:t>
-      </w:r>
-      <w:r>
-        <w:rPr>
-          <w:lang w:val="en-US"/>
-        </w:rPr>
-        <w:t>trace_id</w:t>
-      </w:r>
-      <w:r>
-        <w:rPr>
-          <w:lang w:val="en-US"/>
-        </w:rPr>
-        <w:t xml:space="preserve"> </w:t>
-      </w:r>
-      <w:r>
-        <w:rPr>
-          <w:lang w:val="en-US"/>
-        </w:rPr>
-        <w:t>liên</w:t>
-      </w:r>
-      <w:r>
-        <w:rPr>
-          <w:lang w:val="en-US"/>
-        </w:rPr>
-        <w:t xml:space="preserve"> </w:t>
-      </w:r>
-      <w:r>
-        <w:rPr>
-          <w:lang w:val="en-US"/>
-        </w:rPr>
-        <w:t>tục</w:t>
-      </w:r>
-      <w:r>
-        <w:rPr>
-          <w:lang w:val="en-US"/>
-        </w:rPr>
-        <w:t xml:space="preserve"> qua </w:t>
-      </w:r>
-      <w:r>
-        <w:rPr>
-          <w:lang w:val="en-US"/>
-        </w:rPr>
-        <w:t>toàn</w:t>
-      </w:r>
-      <w:r>
-        <w:rPr>
-          <w:lang w:val="en-US"/>
-        </w:rPr>
-        <w:t xml:space="preserve"> </w:t>
-      </w:r>
-      <w:r>
-        <w:rPr>
-          <w:lang w:val="en-US"/>
-        </w:rPr>
-        <w:t>bộ</w:t>
-      </w:r>
-      <w:r>
-        <w:rPr>
-          <w:lang w:val="en-US"/>
-        </w:rPr>
-        <w:t xml:space="preserve"> </w:t>
-      </w:r>
-      <w:r>
-        <w:rPr>
-          <w:lang w:val="en-US"/>
-        </w:rPr>
-        <w:t>luồng</w:t>
-      </w:r>
-      <w:r>
-        <w:rPr>
-          <w:lang w:val="en-US"/>
-        </w:rPr>
-        <w:t xml:space="preserve"> </w:t>
-      </w:r>
-      <w:r>
-        <w:rPr>
-          <w:lang w:val="en-US"/>
-        </w:rPr>
-        <w:t>xử</w:t>
-      </w:r>
-      <w:r>
-        <w:rPr>
-          <w:lang w:val="en-US"/>
-        </w:rPr>
-        <w:t xml:space="preserve"> </w:t>
-      </w:r>
-      <w:r>
-        <w:rPr>
-          <w:lang w:val="en-US"/>
-        </w:rPr>
-        <w:t>lý</w:t>
-      </w:r>
-      <w:r>
-        <w:rPr>
-          <w:lang w:val="en-US"/>
-        </w:rPr>
-        <w:t xml:space="preserve"> </w:t>
-      </w:r>
-      <w:r>
-        <w:rPr>
-          <w:lang w:val="en-US"/>
-        </w:rPr>
-        <w:t>giữa</w:t>
-      </w:r>
-      <w:r>
-        <w:rPr>
-          <w:lang w:val="en-US"/>
-        </w:rPr>
-        <w:t xml:space="preserve"> </w:t>
-      </w:r>
-      <w:r>
-        <w:rPr>
-          <w:lang w:val="en-US"/>
-        </w:rPr>
-        <w:t>các</w:t>
-      </w:r>
-      <w:r>
-        <w:rPr>
-          <w:lang w:val="en-US"/>
-        </w:rPr>
-        <w:t xml:space="preserve"> service</w:t>
+        <w:t>☐ Trace ID liên tục qua toàn bộ luồng xử lý giữa các service</w:t>
       </w:r>
     </w:p>
     <w:p>
@@ -17330,70 +16843,7 @@
         <w:rPr/>
       </w:pPr>
       <w:r>
-        <w:rPr>
-          <w:lang w:val="en-US"/>
-        </w:rPr>
-        <w:t xml:space="preserve">☐ Log correlate </w:t>
-      </w:r>
-      <w:r>
-        <w:rPr>
-          <w:lang w:val="en-US"/>
-        </w:rPr>
-        <w:t>được</w:t>
-      </w:r>
-      <w:r>
-        <w:rPr>
-          <w:lang w:val="en-US"/>
-        </w:rPr>
-        <w:t xml:space="preserve"> </w:t>
-      </w:r>
-      <w:r>
-        <w:rPr>
-          <w:lang w:val="en-US"/>
-        </w:rPr>
-        <w:t>về</w:t>
-      </w:r>
-      <w:r>
-        <w:rPr>
-          <w:lang w:val="en-US"/>
-        </w:rPr>
-        <w:t xml:space="preserve"> </w:t>
-      </w:r>
-      <w:r>
-        <w:rPr>
-          <w:lang w:val="en-US"/>
-        </w:rPr>
-        <w:t>đúng</w:t>
-      </w:r>
-      <w:r>
-        <w:rPr>
-          <w:lang w:val="en-US"/>
-        </w:rPr>
-        <w:t xml:space="preserve"> </w:t>
-      </w:r>
-      <w:r>
-        <w:rPr>
-          <w:lang w:val="en-US"/>
-        </w:rPr>
-        <w:t>trace_id</w:t>
-      </w:r>
-      <w:r>
-        <w:rPr>
-          <w:lang w:val="en-US"/>
-        </w:rPr>
-        <w:t xml:space="preserve"> </w:t>
-      </w:r>
-      <w:r>
-        <w:rPr>
-          <w:lang w:val="en-US"/>
-        </w:rPr>
-        <w:t>của</w:t>
-      </w:r>
-      <w:r>
-        <w:rPr>
-          <w:lang w:val="en-US"/>
-        </w:rPr>
-        <w:t xml:space="preserve"> request</w:t>
+        <w:t>☐ Log correlate được về đúng Trace ID của request</w:t>
       </w:r>
     </w:p>
     <w:p>

</xml_diff>